<commit_message>
feat(scan): configurable auto-refresh of the offline cache on page open
Previously the 24h offline cache (used as a degraded-mode fallback for
QR scanning) only downloaded on manual click, even though CONTEXT.md
already documented the intent of refreshing it "at each connection".

- New config key SCAN_CACHE_AUTO_REFRESH (migration V7, default true)
- ScanPage: triggers rafraichirCache() once on mount if enabled and
  online (guarded by a ref, waits for the config to finish loading)
- ConfigurationPage: new toggle under "Scan & Accès" to enable/disable
  the behavior — manual download via the existing button always works
  regardless of this setting
- manuel-utilisateur.md/.docx updated to document the new setting

Verified end-to-end with Playwright: cache cleared + setting enabled
-> auto-downloads on page load; setting disabled via Configuration +
cache cleared -> stays "Cache absent" until manual download.

Co-Authored-By: Claude Sonnet 5 <noreply@anthropic.com>
</commit_message>
<xml_diff>
--- a/collaboration/doc/manuel-utilisateur.docx
+++ b/collaboration/doc/manuel-utilisateur.docx
@@ -2362,7 +2362,7 @@
       </w:pPr>
       <w:r>
         <w:rPr/>
-        <w:t xml:space="preserve">Fonctionne hors-ligne via un cache local de 24h, resynchronisé à la reconnexion. </w:t>
+        <w:t xml:space="preserve">Fonctionne hors-ligne via un cache local de 24h (liste des élèves actifs + statut d'accès), resynchronisé à la reconnexion. </w:t>
       </w:r>
     </w:p>
     <w:p>
@@ -2377,6 +2377,56 @@
           <w:tab w:val="left" w:pos="709" w:leader="none"/>
         </w:tabs>
         <w:bidi w:val="0"/>
+        <w:spacing w:before="0" w:after="0"/>
+        <w:ind w:left="709" w:hanging="283"/>
+        <w:jc w:val="left"/>
+        <w:rPr/>
+      </w:pPr>
+      <w:r>
+        <w:rPr/>
+        <w:t xml:space="preserve">Barre de statut : indicateur « En ligne »/« Hors ligne », état du cache (« Cache absent » ou « Cache : X élèves · âge »), bouton de téléchargement manuel du cache. </w:t>
+      </w:r>
+    </w:p>
+    <w:p>
+      <w:pPr>
+        <w:pStyle w:val="TextBody"/>
+        <w:numPr>
+          <w:ilvl w:val="0"/>
+          <w:numId w:val="4"/>
+        </w:numPr>
+        <w:tabs>
+          <w:tab w:val="clear" w:pos="1134"/>
+          <w:tab w:val="left" w:pos="709" w:leader="none"/>
+        </w:tabs>
+        <w:bidi w:val="0"/>
+        <w:spacing w:before="0" w:after="0"/>
+        <w:ind w:left="709" w:hanging="283"/>
+        <w:jc w:val="left"/>
+        <w:rPr/>
+      </w:pPr>
+      <w:r>
+        <w:rPr>
+          <w:rStyle w:val="StrongEmphasis"/>
+        </w:rPr>
+        <w:t>Rafraîchissement automatique du cache</w:t>
+      </w:r>
+      <w:r>
+        <w:rPr/>
+        <w:t xml:space="preserve"> : si activé (réglage par défaut, voir § Configuration), le cache est téléchargé silencieusement à l'ouverture de la page si une connexion est disponible — pas besoin de cliquer manuellement. Désactivable pour repasser en téléchargement manuel uniquement. </w:t>
+      </w:r>
+    </w:p>
+    <w:p>
+      <w:pPr>
+        <w:pStyle w:val="TextBody"/>
+        <w:numPr>
+          <w:ilvl w:val="0"/>
+          <w:numId w:val="4"/>
+        </w:numPr>
+        <w:tabs>
+          <w:tab w:val="clear" w:pos="1134"/>
+          <w:tab w:val="left" w:pos="709" w:leader="none"/>
+        </w:tabs>
+        <w:bidi w:val="0"/>
         <w:ind w:left="709" w:hanging="283"/>
         <w:jc w:val="left"/>
         <w:rPr/>
@@ -2749,6 +2799,28 @@
       <w:r>
         <w:rPr/>
         <w:t xml:space="preserve">Activation/désactivation des notifications email et SMS. </w:t>
+      </w:r>
+    </w:p>
+    <w:p>
+      <w:pPr>
+        <w:pStyle w:val="TextBody"/>
+        <w:numPr>
+          <w:ilvl w:val="0"/>
+          <w:numId w:val="8"/>
+        </w:numPr>
+        <w:tabs>
+          <w:tab w:val="clear" w:pos="1134"/>
+          <w:tab w:val="left" w:pos="709" w:leader="none"/>
+        </w:tabs>
+        <w:bidi w:val="0"/>
+        <w:spacing w:before="0" w:after="0"/>
+        <w:ind w:left="709" w:hanging="283"/>
+        <w:jc w:val="left"/>
+        <w:rPr/>
+      </w:pPr>
+      <w:r>
+        <w:rPr/>
+        <w:t xml:space="preserve">Activation/désactivation du rafraîchissement automatique du cache hors-ligne (Scan Réfectoire) — activé par défaut. </w:t>
       </w:r>
     </w:p>
     <w:p>

</xml_diff>